<commit_message>
Checkpoint benchmark budgets, workflow labels, and grant updates
</commit_message>
<xml_diff>
--- a/outputs/grant_revision_2026-09-06/R01_Subaims_1a_1b_Approach_Rewritten.docx
+++ b/outputs/grant_revision_2026-09-06/R01_Subaims_1a_1b_Approach_Rewritten.docx
@@ -219,7 +219,7 @@
         <w:widowControl/>
       </w:pPr>
       <w:r>
-        <w:t>Clinical runs will allow 25 iterations and cell-line runs 10, with equal token and tool budgets within each paired comparison. Broad exploration and focused follow-up will remain available throughout, without mandatory early or late phases or category quotas. The reference harness executes structured analysis requests; extensions to agent-written code or literature-search tools will require separately specified evaluations. Discovery analyses return 95% Welch confidence intervals and require at least 20 observations in each comparison cell.</w:t>
+        <w:t>Clinical and cell-line runs will both allow 25 iterations, with equal token and tool budgets within each paired comparison. Broad exploration and focused follow-up will remain available throughout, without mandatory early or late phases or category quotas. The reference harness executes structured analysis requests; extensions to agent-written code or literature-search tools will require separately specified evaluations. Discovery analyses return 95% Welch confidence intervals and require at least 20 observations in each comparison cell.</w:t>
       </w:r>
     </w:p>
     <w:p>
@@ -836,7 +836,7 @@
         <w:widowControl/>
       </w:pPr>
       <w:r>
-        <w:t>The reference workflow permits two technical retries per stage for malformed responses or contract violations. Scientific disagreement with the evaluator will never trigger a retry. Runs that exhaust retries will remain in the assigned denominator with zero primary recovery of the key discovery and F1*, alongside separate results using first attempts only; documented infrastructure outages will follow a prespecified policy. Access controls will separate agent workspaces from generators, answer keys, and confirmation samples. Provider adapters will keep the workflow independent of any testing server. Before formal evaluation, six-iteration smoke tests will check both task families and paired versions, using scheduled validation in iterations 2 and 4 and error probability 0.05/12. These shorter tests will verify execution and scoring; the full study will retain its 25- and 10-iteration budgets.</w:t>
+        <w:t>The reference workflow permits two technical retries per stage for malformed responses or contract violations. Scientific disagreement with the evaluator will never trigger a retry. Runs that exhaust retries will remain in the assigned denominator with zero primary recovery of the key discovery and F1*, alongside separate results using first attempts only; documented infrastructure outages will follow a prespecified policy. Access controls will separate agent workspaces from generators, answer keys, and confirmation samples. Provider adapters will keep the workflow independent of any testing server. Before formal evaluation, six-iteration smoke tests will check both task families and paired versions, using scheduled validation in iterations 2 and 4 and error probability 0.05/12. These shorter tests will verify execution and scoring; the full study will use 25 iterations for both task families.</w:t>
       </w:r>
     </w:p>
     <w:p>

</xml_diff>